<commit_message>
Aprobación posterior de excesos internos (Pendiente / Aprobar / Rechazar)
Co-Authored-By: Claude Sonnet 5.5 <noreply@anthropic.com>
Claude-Session: https://claude.ai/code/session_01LasPtPWZ9DiXFQxAHJhmgi
</commit_message>
<xml_diff>
--- a/docs/Front_de_Inversiones_Descripcion_Funcional.docx
+++ b/docs/Front_de_Inversiones_Descripcion_Funcional.docx
@@ -11717,7 +11717,7 @@
                 <w:sz w:val="21"/>
                 <w:szCs w:val="21"/>
               </w:rPr>
-              <w:t xml:space="preserve">Motivo y aprobador, que se registran al continuar con un exceso interno — </w:t>
+              <w:t xml:space="preserve">Motivo y aprobador, que se registran al continuar con un exceso interno, o el motivo solo si la aprobación se pide para después — </w:t>
             </w:r>
             <w:r>
               <w:rPr>
@@ -11799,7 +11799,43 @@
                 <w:sz w:val="21"/>
                 <w:szCs w:val="21"/>
               </w:rPr>
-              <w:t xml:space="preserve">Cada exceso queda registrado: el normativo como «Bloqueado» (no se permitió la orden) y el interno como «Aprobado» (con motivo y aprobador).</w:t>
+              <w:t xml:space="preserve">Cada exceso queda registrado: el normativo como «Bloqueado» (no se permitió la orden) y el interno como «Aprobado» (con motivo y aprobador) o «Pendiente» si quien registra la orden pidió la aprobación posterior.</w:t>
+            </w:r>
+          </w:p>
+          <w:p>
+            <w:pPr>
+              <w:pStyle w:val="ListParagraph"/>
+              <w:numPr>
+                <w:ilvl w:val="0"/>
+                <w:numId w:val="2"/>
+              </w:numPr>
+              <w:spacing w:after="60" w:line="264"/>
+            </w:pPr>
+            <w:r>
+              <w:rPr>
+                <w:rFonts w:ascii="Arial" w:cs="Arial" w:eastAsia="Arial" w:hAnsi="Arial"/>
+                <w:sz w:val="21"/>
+                <w:szCs w:val="21"/>
+              </w:rPr>
+              <w:t xml:space="preserve">Con un exceso interno, quien registra la orden elige entre aprobar ahora (indica el aprobador) o solicitar la aprobación posterior (solo indica el motivo). En el segundo caso la orden queda registrada pero no se puede confirmar mientras el exceso siga pendiente.</w:t>
+            </w:r>
+          </w:p>
+          <w:p>
+            <w:pPr>
+              <w:pStyle w:val="ListParagraph"/>
+              <w:numPr>
+                <w:ilvl w:val="0"/>
+                <w:numId w:val="2"/>
+              </w:numPr>
+              <w:spacing w:after="60" w:line="264"/>
+            </w:pPr>
+            <w:r>
+              <w:rPr>
+                <w:rFonts w:ascii="Arial" w:cs="Arial" w:eastAsia="Arial" w:hAnsi="Arial"/>
+                <w:sz w:val="21"/>
+                <w:szCs w:val="21"/>
+              </w:rPr>
+              <w:t xml:space="preserve">Un usuario distinto de quien solicitó la excepción aprueba o rechaza el exceso pendiente desde esta pantalla. Si lo aprueba, la orden puede confirmarse; si lo rechaza (con motivo), la orden queda anulada. Ambas decisiones quedan en la bitácora de auditoría.</w:t>
             </w:r>
           </w:p>
           <w:p>
@@ -11888,7 +11924,7 @@
                 <w:sz w:val="21"/>
                 <w:szCs w:val="21"/>
               </w:rPr>
-              <w:t xml:space="preserve">Un registro que no se edita, con quién solicitó, quién aprobó, el motivo y el resultado, para auditoría.</w:t>
+              <w:t xml:space="preserve">Un registro con quién solicitó, quién aprobó o rechazó, el motivo y el resultado (aprobado, pendiente, rechazado o bloqueado); solo los pendientes admiten acciones.</w:t>
             </w:r>
           </w:p>
         </w:tc>
@@ -15830,7 +15866,7 @@
           <w:sz w:val="21"/>
           <w:szCs w:val="21"/>
         </w:rPr>
-        <w:t xml:space="preserve">Si la aprobación de un exceso interno siempre se da en el momento de registrar, o si puede llegar después.</w:t>
+        <w:t xml:space="preserve">Cuánto tiempo puede permanecer pendiente un exceso interno antes de escalarse, y quién puede aprobarlo en cada fondo: en el prototipo cualquier usuario distinto de quien lo solicitó.</w:t>
       </w:r>
     </w:p>
     <w:p>
@@ -21840,7 +21876,7 @@
                 <w:sz w:val="19"/>
                 <w:szCs w:val="19"/>
               </w:rPr>
-              <w:t xml:space="preserve">Motivo y aprobador, que se registran al continuar con un exceso interno</w:t>
+              <w:t xml:space="preserve">Motivo y aprobador, que se registran al continuar con un exceso interno, o el motivo solo si la aprobación se pide para después</w:t>
             </w:r>
           </w:p>
         </w:tc>

</xml_diff>